<commit_message>
Deepen chapter 2 series prologue
</commit_message>
<xml_diff>
--- a/deliverables/문병로_교수의_메트릭_스튜디오_02_00_블로그_게시용.docx
+++ b/deliverables/문병로_교수의_메트릭_스튜디오_02_00_블로그_게시용.docx
@@ -143,7 +143,15 @@
           <w:rFonts w:ascii="Malgun Gothic" w:hAnsi="Malgun Gothic" w:eastAsia="Malgun Gothic"/>
           <w:sz w:val="22"/>
         </w:rPr>
-        <w:t>다시 읽자 이 문장들은 같은 문제를 가리키고 있었다. 내가 관측한 수익률은 시장의 성질인가, 아니면 내가 선택한 측정 방식의 성질인가. 유동성 상위 80%라는 숫자는 시장의 보편 법칙이 아니라, 운용 규모와 주문 방식이 바뀌면 함께 바뀌는 제약조건일 수 있다. 거래회전율이 높다는 사실은 관심이 많다는 뜻이 아니라 기관의 리밸런싱이나 유동성 공급의 결과일 수 있다. 여러 모델이 같은 종목을 고르는 일도 독립된 증거가 아니라 같은 가격 데이터를 여러 번 센 결과일 수 있다.</w:t>
+        <w:t xml:space="preserve">유동성의 기준을 어디에 두는지, 관심을 거래회전율로 정의하는지, 모멘텀과 반전을 어느 보유기간으로 측정하는지에 따라 같은 시장에서도 다른 결론이 나온다. 문제는 어느 전략이 이겼는지가 아니다. </w:t>
+      </w:r>
+      <w:r>
+        <w:rPr>
+          <w:rFonts w:ascii="Malgun Gothic" w:hAnsi="Malgun Gothic" w:eastAsia="Malgun Gothic"/>
+          <w:b/>
+          <w:sz w:val="22"/>
+        </w:rPr>
+        <w:t>내가 관측한 수익률은 시장의 성질인가, 아니면 내가 선택한 측정 방식의 성질인가.</w:t>
       </w:r>
     </w:p>
     <w:p>
@@ -155,7 +163,7 @@
           <w:rFonts w:ascii="Malgun Gothic" w:hAnsi="Malgun Gothic" w:eastAsia="Malgun Gothic"/>
           <w:sz w:val="22"/>
         </w:rPr>
-        <w:t>이 지점에서 책의 결론을 정리하는 글과 연구 노트는 갈라진다. 독후감이라면 저자의 설명을 이해한 뒤 그 의미를 적으면 된다. 나는 이번에는 그 설명이 어떤 전제 위에서만 성립하는지 적고 싶었다. 그리고 그 전제가 틀렸을 때 결과가 어떻게 달라지는지, 내가 가진 한국 주식 수정주가·거래량·시가총액 데이터로 직접 확인하고 싶었다.</w:t>
+        <w:t>유동성 상위 80%라는 숫자는 시장의 보편 법칙이 아니다. 운용 규모와 주문 방식이 바뀌면 함께 바뀌는 제약조건일 수 있다. 거래회전율이 높다는 사실도 관심이 많다는 뜻으로 바로 번역할 수 없다. 기관의 리밸런싱, 불확실성, 유동성 공급이 같은 숫자를 만들 수 있다. 여러 모델이 같은 종목을 고르는 일 역시 독립된 증거가 아니라, 같은 가격·거래량·시가총액을 서로 다른 이름으로 여러 번 읽은 결과일 수 있다.</w:t>
       </w:r>
     </w:p>
     <w:p>
@@ -167,7 +175,19 @@
           <w:rFonts w:ascii="Malgun Gothic" w:hAnsi="Malgun Gothic" w:eastAsia="Malgun Gothic"/>
           <w:sz w:val="22"/>
         </w:rPr>
-        <w:t>그래서 책의 결론을 재현하지 않기로 했다. 책에서 한 문장을 읽을 때마다 그 문장이 의존하는 전제를 하나씩 분리하고, 반대 방향의 검증을 붙였다. 결과가 책과 다르다고 해서 책이 틀렸다는 뜻은 아니다. 시장, 표본, 비용, 보유기간, 그리고 같은 숫자에 붙인 이름이 달라졌다는 뜻이다. 오히려 그 차이를 확인해야 책의 문장이 어느 범위에서 유효한지 알 수 있다.</w:t>
+        <w:t>이 의심은 내 프로젝트에서 이미 한 번 문제를 일으켰다. 당시에는 조건을 추가해 수익률을 높이는 데 집중했다. 이번에는 순서를 바꿨다. 먼저 수익률이 왜 달라졌는지 확인하기로 했다. 한국 주식의 수정주가·거래량·시가총액 데이터에서 유동성 기준, 종목 수, 운용 규모, 비용, 보유기간을 바꿔 가며 결과를 다시 계산했다. 뉴스량을 별도로 연결했고, 서로 다른 모델의 신호가 정말 다른 정보를 담는지도 확인했다.</w:t>
+      </w:r>
+    </w:p>
+    <w:p>
+      <w:pPr>
+        <w:spacing w:after="160" w:line="320" w:lineRule="auto"/>
+      </w:pPr>
+      <w:r>
+        <w:rPr>
+          <w:rFonts w:ascii="Malgun Gothic" w:hAnsi="Malgun Gothic" w:eastAsia="Malgun Gothic"/>
+          <w:sz w:val="22"/>
+        </w:rPr>
+        <w:t>책의 결론을 그대로 재현하려는 작업은 아니었다. 예를 들어 유동성 상위 80%가 유리하다는 결과가 나와도, 그 숫자가 특정 운용 규모와 비용 가정에서만 성립한다면 나는 ‘80%’를 전략의 규칙으로 쓸 수 없다. 책과 다른 결과가 나왔을 때도 같은 기준을 적용했다. 누가 맞는지를 가르는 대신, 표본과 비용, 보유기간이 달라질 때 결론이 어디까지 버티는지를 확인했다.</w:t>
       </w:r>
     </w:p>
     <w:p>
@@ -203,7 +223,31 @@
           <w:rFonts w:ascii="Malgun Gothic" w:hAnsi="Malgun Gothic" w:eastAsia="Malgun Gothic"/>
           <w:sz w:val="22"/>
         </w:rPr>
-        <w:t>나는 유동성 컷, 보유 종목 수, 운용 규모, 거래비용을 함께 움직였다. 목표는 수익률이 가장 높은 점 하나를 찾는 일이 아니었다. 비용을 조금 올리고 유동성 기준을 한 칸 바꿔도 남는 전략 영역이 있는지 확인하는 일이었다. 1편에서 이 결과를 ‘봉우리’와 ‘대륙’이라는 질문으로 정리한다.</w:t>
+        <w:t>책의 숫자를 읽을 때 가장 조심할 부분은, 유동성이 종목의 고정된 속성처럼 보인다는 점이다. 그러나 유동성은 거래하려는 금액과 분리되지 않는다. 하루 거래대금이 같은 두 종목이라도 1억 원을 나눠 거래할 때와 100억 원을 집행할 때의 의미는 다르다. 전자는 시장에 거의 흔적을 남기지 않을 수 있지만, 후자는 가격을 움직이는 주문이 될 수 있다. 백테스트의 수익률은 이 차이를 자동으로 반영하지 않는다.</w:t>
+      </w:r>
+    </w:p>
+    <w:p>
+      <w:pPr>
+        <w:spacing w:after="160" w:line="320" w:lineRule="auto"/>
+      </w:pPr>
+      <w:r>
+        <w:rPr>
+          <w:rFonts w:ascii="Malgun Gothic" w:hAnsi="Malgun Gothic" w:eastAsia="Malgun Gothic"/>
+          <w:sz w:val="22"/>
+        </w:rPr>
+        <w:t>나는 유동성 컷, 보유 종목 수, 운용 규모, 거래비용을 함께 움직였다. 상위 20%부터 100%까지 유니버스를 넓히고, 포트폴리오 규모와 비용 가정을 동시에 바꿨다. 목표는 수익률이 가장 높은 점 하나를 찾는 일이 아니었다. 비용을 조금 올리고 유동성 기준을 한 칸 바꿔도 남는 전략 영역이 있는지 확인하는 일이었다.</w:t>
+      </w:r>
+    </w:p>
+    <w:p>
+      <w:pPr>
+        <w:spacing w:after="160" w:line="320" w:lineRule="auto"/>
+      </w:pPr>
+      <w:r>
+        <w:rPr>
+          <w:rFonts w:ascii="Malgun Gothic" w:hAnsi="Malgun Gothic" w:eastAsia="Malgun Gothic"/>
+          <w:sz w:val="22"/>
+        </w:rPr>
+        <w:t>여기서 중요한 것은 ‘상위 80%가 좋다’는 결론 자체가 아니다. 수익률이 가장 높은 조합이 한두 조건에서만 나타난다면, 그 결과는 전략이라기보다 백테스트 표면 위의 봉우리다. 반대로 인접한 조건에서도 비슷한 성과가 남는다면, 그때에야 운용 가능한 영역이라고 부를 근거가 생긴다. 1편에서는 이 차이를 ‘봉우리’와 ‘대륙’이라는 질문으로 정리한다.</w:t>
       </w:r>
     </w:p>
     <w:p>
@@ -239,7 +283,31 @@
           <w:rFonts w:ascii="Malgun Gothic" w:hAnsi="Malgun Gothic" w:eastAsia="Malgun Gothic"/>
           <w:sz w:val="22"/>
         </w:rPr>
-        <w:t>이번에는 원천 뉴스 헤드라인 수를 다시 연결해, 거래회전율과 뉴스량이 정말 같은 종목을 가리키는지부터 비교했다. 이 질문은 인기주의 예후를 맞히는 문제가 아니다. 무엇을 관측하지 못하고 있으면서 관심이라는 이름을 붙였는지 확인하는 문제다. 2편은 이 편리한 해석이 실제 데이터에서 무너지는 과정을 기록한다.</w:t>
+        <w:t>‘관심’은 특히 위험한 이름이다. 관찰할 수 없는 투자자 심리를 하나의 거래 변수로 대신 부른 순간, 변수의 한계가 사라진 것처럼 보이기 때문이다. 회전율이 높아도 뉴스가 없을 수 있다. 반대로 뉴스가 집중돼도 큰 주주가 움직이지 않아 회전율이 낮을 수 있다. 두 경우를 같은 관심도로 부르면, 뒤에 나오는 성과 해석까지 흔들린다.</w:t>
+      </w:r>
+    </w:p>
+    <w:p>
+      <w:pPr>
+        <w:spacing w:after="160" w:line="320" w:lineRule="auto"/>
+      </w:pPr>
+      <w:r>
+        <w:rPr>
+          <w:rFonts w:ascii="Malgun Gothic" w:hAnsi="Malgun Gothic" w:eastAsia="Malgun Gothic"/>
+          <w:sz w:val="22"/>
+        </w:rPr>
+        <w:t>이번에는 원천 뉴스 헤드라인 수를 다시 연결해, 거래회전율과 뉴스량이 정말 같은 종목을 가리키는지부터 비교했다. 같은 달에 두 지표가 상위권으로 분류한 종목이 얼마나 겹치는지, 뉴스가 많은 종목에서만 회전율과 다음 달 성과의 관계가 달라지는지 살폈다. 뉴스량은 관심 그 자체가 아니라, 최소한 회전율과 다른 관측 창을 제공한다.</w:t>
+      </w:r>
+    </w:p>
+    <w:p>
+      <w:pPr>
+        <w:spacing w:after="160" w:line="320" w:lineRule="auto"/>
+      </w:pPr>
+      <w:r>
+        <w:rPr>
+          <w:rFonts w:ascii="Malgun Gothic" w:hAnsi="Malgun Gothic" w:eastAsia="Malgun Gothic"/>
+          <w:sz w:val="22"/>
+        </w:rPr>
+        <w:t>이 질문은 인기주의 예후를 맞히는 문제가 아니다. 무엇을 관측하지 못하고 있으면서 관심이라는 이름을 붙였는지 확인하는 문제다. 2편은 회전율이라는 편리한 해석이 실제 데이터에서 어디까지 무너지는지, 그리고 대체 변수를 붙여도 무엇이 여전히 보이지 않는지를 기록한다.</w:t>
       </w:r>
     </w:p>
     <w:p>
@@ -275,7 +343,31 @@
           <w:rFonts w:ascii="Malgun Gothic" w:hAnsi="Malgun Gothic" w:eastAsia="Malgun Gothic"/>
           <w:sz w:val="22"/>
         </w:rPr>
-        <w:t>하지만 서로 다른 이름의 모델이 모두 가격·거래량·시가총액에서 출발했다면, 그 표는 독립적이지 않다. 여러 사람이 같은 기사 하나를 읽고 같은 결론을 냈다고 해서 근거가 여러 배가 되지는 않는다. 3편에서는 실제로 모델의 표를 많이 받은 종목만 모았을 때 왜 성과가 무너졌는지 확인한다.</w:t>
+        <w:t>조건을 더 붙이는 방식은 직관적으로 안전해 보인다. 한 신호가 틀려도 나머지 신호가 걸러 줄 것 같기 때문이다. 그러나 신호들이 같은 원천 데이터의 다른 변형이라면, 합의는 분산이 아니라 중복일 수 있다. 저변동성·유동성·모멘텀의 이름이 달라도 결국 최근 가격과 거래량의 패턴을 다르게 자른 것이라면, 동시에 같은 오류를 낼 가능성도 커진다.</w:t>
+      </w:r>
+    </w:p>
+    <w:p>
+      <w:pPr>
+        <w:spacing w:after="160" w:line="320" w:lineRule="auto"/>
+      </w:pPr>
+      <w:r>
+        <w:rPr>
+          <w:rFonts w:ascii="Malgun Gothic" w:hAnsi="Malgun Gothic" w:eastAsia="Malgun Gothic"/>
+          <w:sz w:val="22"/>
+        </w:rPr>
+        <w:t>그래서 모델이 몇 표를 던졌는지만 세지 않았다. 각 모델의 순위와 선택 종목이 월별로 얼마나 겹치는지, 모델 합의가 높은 종목이 단일 모델보다 실제로 더 나은지, 그리고 합의가 깨지는 달에는 어떤 일이 일어나는지를 따로 계산했다. 여러 사람이 같은 기사 하나를 읽고 같은 결론을 냈다고 해서 근거가 여러 배가 되지는 않는다.</w:t>
+      </w:r>
+    </w:p>
+    <w:p>
+      <w:pPr>
+        <w:spacing w:after="160" w:line="320" w:lineRule="auto"/>
+      </w:pPr>
+      <w:r>
+        <w:rPr>
+          <w:rFonts w:ascii="Malgun Gothic" w:hAnsi="Malgun Gothic" w:eastAsia="Malgun Gothic"/>
+          <w:sz w:val="22"/>
+        </w:rPr>
+        <w:t>3편에서는 모델의 표를 많이 받은 종목만 모았을 때 왜 성과가 무너졌는지 확인한다. 그 결과가 ‘앙상블은 쓸모없다’는 뜻은 아니다. 어떤 입력의 독립성이 확보되지 않은 앙상블은 증거의 수가 아니라 같은 오류의 반복 횟수를 늘릴 수 있다는 뜻이다.</w:t>
       </w:r>
     </w:p>
     <w:p>
@@ -311,7 +403,7 @@
           <w:rFonts w:ascii="Malgun Gothic" w:hAnsi="Malgun Gothic" w:eastAsia="Malgun Gothic"/>
           <w:sz w:val="22"/>
         </w:rPr>
-        <w:t>그래서 질문을 바꿨다. 어느 모델이 이길지를 묻는 대신, 서로 다른 모델이 같은 시점에 기대를 배반하는지를 보자. 시장의 상태는 상승·하락 같은 사후 이름보다, 내가 독립적이라고 믿었던 모델들이 함께 틀리는 방식으로 더 먼저 드러날 수 있다. 4편은 이 가설을 작은 표본의 예측 규칙으로 과장하지 않고, 검증 가능한 상태 변수로 바꾸는 시도다.</w:t>
+        <w:t>모멘텀과 반전의 대립은 전략 선택 문제처럼 보이지만, 실제로는 시장이 한 가지 방식으로만 움직인다는 전제를 드러낸다. 추세가 이어지는 국면에서는 모멘텀이, 과도한 가격 조정이 일어나는 국면에서는 반전이 더 잘 보일 수 있다. 어느 쪽이 영구적으로 옳은지를 찾기 시작하면, 과거 데이터에 맞춘 파라미터만 계속 늘어난다.</w:t>
       </w:r>
     </w:p>
     <w:p>
@@ -323,7 +415,31 @@
           <w:rFonts w:ascii="Malgun Gothic" w:hAnsi="Malgun Gothic" w:eastAsia="Malgun Gothic"/>
           <w:sz w:val="22"/>
         </w:rPr>
-        <w:t>이 연재의 목적은 네 개의 전략을 추천하는 데 있지 않다. 수익률이 잘 나온 전략보다 먼저, 처음의 해석이 어디에서 깨졌는지를 남기는 데 있다. 좋은 연구는 결론을 많이 모으는 일이 아니라, 어떤 결론을 아직 말할 수 없는지 구분하는 일에서 시작한다고 보기 때문이다.</w:t>
+        <w:t>그래서 질문을 바꿨다. 어느 모델이 다음 달을 맞힐지를 묻는 대신, 서로 다른 모델이 같은 시점에 기대를 배반하는지를 보자. 각 모델의 월별 성과를 표준화하고, 동시에 부진한 모델 수와 그 다음 시장 수익률의 관계를 점검했다. 여기서 모델의 공동 실패는 매수·매도 신호가 아니다. 내가 서로 독립적이라고 믿었던 설명들이 같은 충격에 무너졌다는 관측치다.</w:t>
+      </w:r>
+    </w:p>
+    <w:p>
+      <w:pPr>
+        <w:spacing w:after="160" w:line="320" w:lineRule="auto"/>
+      </w:pPr>
+      <w:r>
+        <w:rPr>
+          <w:rFonts w:ascii="Malgun Gothic" w:hAnsi="Malgun Gothic" w:eastAsia="Malgun Gothic"/>
+          <w:sz w:val="22"/>
+        </w:rPr>
+        <w:t>시장의 상태는 상승·하락 같은 사후 이름보다, 모델들이 함께 틀리는 방식으로 먼저 드러날 수 있다. 물론 작은 표본에서 나온 이 관계를 예측 규칙으로 과장할 수는 없다. 4편은 이 가설을 검증 가능한 상태 변수로 바꾸고, 어느 구간에서는 작동하지 않는지도 함께 남기는 시도다.</w:t>
+      </w:r>
+    </w:p>
+    <w:p>
+      <w:pPr>
+        <w:spacing w:after="160" w:line="320" w:lineRule="auto"/>
+      </w:pPr>
+      <w:r>
+        <w:rPr>
+          <w:rFonts w:ascii="Malgun Gothic" w:hAnsi="Malgun Gothic" w:eastAsia="Malgun Gothic"/>
+          <w:sz w:val="22"/>
+        </w:rPr>
+        <w:t>이 연재의 목적은 네 개의 전략을 추천하는 데 있지 않다. 수익률이 잘 나온 전략보다 먼저, 처음의 해석이 어디에서 깨졌는지를 남기는 데 있다. 백테스트는 대개 가장 좋은 숫자를 앞에 놓지만, 실제 운용에서 중요한 것은 그 숫자가 어떤 가정을 요구했는지다. 슬리피지 한 칸, 보유기간 한 달, 거래 가능한 종목 수 몇 개가 바뀌었을 때 사라지는 성과라면, 수익률보다 그 사라짐의 구조가 먼저 기록되어야 한다.</w:t>
       </w:r>
     </w:p>
     <w:p>

</xml_diff>

<commit_message>
Replace AI quote cards with expanded chapter 2 prose
</commit_message>
<xml_diff>
--- a/deliverables/문병로_교수의_메트릭_스튜디오_02_00_블로그_게시용.docx
+++ b/deliverables/문병로_교수의_메트릭_스튜디오_02_00_블로그_게시용.docx
@@ -79,60 +79,50 @@
         <w:t>책은 유동성 유니버스를 넓힐수록 이론 수익률이 높아질 수 있지만, 저유동성 종목이 늘어나면 슬리피지가 이를 잠식한다고 말한다. 인기주와 비인기주의 성과, 모멘텀과 반전의 엇갈린 결과도 함께 제시한다. 처음에는 서로 다른 주제의 흥미로운 결론처럼 읽혔다.</w:t>
       </w:r>
     </w:p>
+    <w:tbl>
+      <w:tblPr>
+        <w:tblW w:type="auto" w:w="0"/>
+        <w:jc w:val="center"/>
+        <w:tblLayout w:type="fixed"/>
+        <w:tblLook w:firstColumn="1" w:firstRow="1" w:lastColumn="0" w:lastRow="0" w:noHBand="0" w:noVBand="1" w:val="04A0"/>
+      </w:tblPr>
+      <w:tblGrid>
+        <w:gridCol w:w="9360"/>
+      </w:tblGrid>
+      <w:tr>
+        <w:tc>
+          <w:tcPr>
+            <w:tcW w:type="dxa" w:w="9072"/>
+            <w:shd w:fill="F4F6F9"/>
+            <w:tcMar>
+              <w:top w:w="110" w:type="dxa"/>
+              <w:start w:w="180" w:type="dxa"/>
+              <w:bottom w:w="110" w:type="dxa"/>
+              <w:end w:w="180" w:type="dxa"/>
+            </w:tcMar>
+            <w:vAlign w:val="center"/>
+          </w:tcPr>
+          <w:p>
+            <w:pPr>
+              <w:spacing w:after="0" w:line="288" w:lineRule="auto"/>
+            </w:pPr>
+            <w:r>
+              <w:rPr>
+                <w:rFonts w:ascii="Malgun Gothic" w:hAnsi="Malgun Gothic" w:eastAsia="Malgun Gothic"/>
+                <w:b/>
+                <w:color w:val="1F3A5F"/>
+                <w:sz w:val="21"/>
+              </w:rPr>
+              <w:t>“유동성 제한이 수익률에 미치는 영향은 포트폴리오와 그 운영 전략에 따라 다르므로 불변의 법칙은 없다.”</w:t>
+            </w:r>
+          </w:p>
+        </w:tc>
+      </w:tr>
+    </w:tbl>
     <w:p>
       <w:pPr>
-        <w:keepNext/>
-        <w:spacing w:before="120" w:after="60"/>
-        <w:jc w:val="center"/>
+        <w:spacing w:after="0"/>
       </w:pPr>
-      <w:r>
-        <w:drawing>
-          <wp:inline xmlns:a="http://schemas.openxmlformats.org/drawingml/2006/main" xmlns:pic="http://schemas.openxmlformats.org/drawingml/2006/picture">
-            <wp:extent cx="5577840" cy="2417064"/>
-            <wp:docPr id="1" name="Picture 1"/>
-            <wp:cNvGraphicFramePr>
-              <a:graphicFrameLocks noChangeAspect="1"/>
-            </wp:cNvGraphicFramePr>
-            <a:graphic>
-              <a:graphicData uri="http://schemas.openxmlformats.org/drawingml/2006/picture">
-                <pic:pic>
-                  <pic:nvPicPr>
-                    <pic:cNvPr id="0" name="09_book_excerpt_liquidity.png"/>
-                    <pic:cNvPicPr/>
-                  </pic:nvPicPr>
-                  <pic:blipFill>
-                    <a:blip r:embed="rId9"/>
-                    <a:stretch>
-                      <a:fillRect/>
-                    </a:stretch>
-                  </pic:blipFill>
-                  <pic:spPr>
-                    <a:xfrm>
-                      <a:off x="0" y="0"/>
-                      <a:ext cx="5577840" cy="2417064"/>
-                    </a:xfrm>
-                    <a:prstGeom prst="rect"/>
-                  </pic:spPr>
-                </pic:pic>
-              </a:graphicData>
-            </a:graphic>
-          </wp:inline>
-        </w:drawing>
-      </w:r>
-    </w:p>
-    <w:p>
-      <w:pPr>
-        <w:pStyle w:val="FigureCaption"/>
-        <w:jc w:val="center"/>
-      </w:pPr>
-      <w:r>
-        <w:rPr>
-          <w:rFonts w:ascii="Malgun Gothic" w:hAnsi="Malgun Gothic" w:eastAsia="Malgun Gothic"/>
-          <w:color w:val="595959"/>
-          <w:sz w:val="18"/>
-        </w:rPr>
-        <w:t>책 2장 발췌 - 유동성 유니버스와 슬리피지</w:t>
-      </w:r>
     </w:p>
     <w:p>
       <w:pPr>
@@ -188,6 +178,30 @@
           <w:sz w:val="22"/>
         </w:rPr>
         <w:t>책의 결론을 그대로 재현하려는 작업은 아니었다. 예를 들어 유동성 상위 80%가 유리하다는 결과가 나와도, 그 숫자가 특정 운용 규모와 비용 가정에서만 성립한다면 나는 ‘80%’를 전략의 규칙으로 쓸 수 없다. 책과 다른 결과가 나왔을 때도 같은 기준을 적용했다. 누가 맞는지를 가르는 대신, 표본과 비용, 보유기간이 달라질 때 결론이 어디까지 버티는지를 확인했다.</w:t>
+      </w:r>
+    </w:p>
+    <w:p>
+      <w:pPr>
+        <w:spacing w:after="160" w:line="320" w:lineRule="auto"/>
+      </w:pPr>
+      <w:r>
+        <w:rPr>
+          <w:rFonts w:ascii="Malgun Gothic" w:hAnsi="Malgun Gothic" w:eastAsia="Malgun Gothic"/>
+          <w:sz w:val="22"/>
+        </w:rPr>
+        <w:t>2장에서 흥미로웠던 것은 정답보다 관찰의 기준이었다. 책은 상승장이었던 기간에도 아무 종목이나 샀을 때 일주일 뒤 수익이 났을 확률이 50%보다 낮았다는 예를 든다. 상승장이라는 사후 이름과 매주 투자자가 겪는 경험은 같지 않을 수 있다는 뜻이다. 나는 백테스트의 연평균 수익률도 같은 방식으로 읽어야 한다고 생각했다. 긴 기간의 평균이 좋아도, 그 결과가 몇 번의 극단적 사건에 기대고 있거나 실제로는 체결하기 어려운 종목에서 나왔다면 투자자가 경험할 전략은 달라진다.</w:t>
+      </w:r>
+    </w:p>
+    <w:p>
+      <w:pPr>
+        <w:spacing w:after="160" w:line="320" w:lineRule="auto"/>
+      </w:pPr>
+      <w:r>
+        <w:rPr>
+          <w:rFonts w:ascii="Malgun Gothic" w:hAnsi="Malgun Gothic" w:eastAsia="Malgun Gothic"/>
+          <w:sz w:val="22"/>
+        </w:rPr>
+        <w:t>주가를 보고도 같은 오류를 범하기 쉽다. “얼마까지 올랐는가”라는 질문은 가격만 보고, “얼마의 자본이 그 가격을 만들었는가”라는 질문은 시가총액과 거래대금을 본다. 나는 이 차이를 유동성 실험에도 그대로 적용했다. 유동성 상위 80%라는 숫자만 보면 종목 집합의 크기만 보인다. 하지만 그 안에서 몇 종목을 들고, 얼마를 주문하며, 주문이 거래대금의 몇 퍼센트를 차지하는지까지 보면 완전히 다른 문제가 된다.</w:t>
       </w:r>
     </w:p>
     <w:p>

</xml_diff>

<commit_message>
Render blog section headings in Word posts
</commit_message>
<xml_diff>
--- a/deliverables/문병로_교수의_메트릭_스튜디오_02_00_블로그_게시용.docx
+++ b/deliverables/문병로_교수의_메트릭_스튜디오_02_00_블로그_게시용.docx
@@ -206,14 +206,10 @@
     </w:p>
     <w:p>
       <w:pPr>
-        <w:spacing w:after="160" w:line="320" w:lineRule="auto"/>
+        <w:pStyle w:val="Heading2"/>
       </w:pPr>
       <w:r>
-        <w:rPr>
-          <w:rFonts w:ascii="Malgun Gothic" w:hAnsi="Malgun Gothic" w:eastAsia="Malgun Gothic"/>
-          <w:sz w:val="22"/>
-        </w:rPr>
-        <w:t>## 1. 유동성 상위 80%가 좋다는 말은 누구에게 유효한가</w:t>
+        <w:t>1. 유동성 상위 80%가 좋다는 말은 누구에게 유효한가</w:t>
       </w:r>
     </w:p>
     <w:p>
@@ -266,14 +262,10 @@
     </w:p>
     <w:p>
       <w:pPr>
-        <w:spacing w:after="160" w:line="320" w:lineRule="auto"/>
+        <w:pStyle w:val="Heading2"/>
       </w:pPr>
       <w:r>
-        <w:rPr>
-          <w:rFonts w:ascii="Malgun Gothic" w:hAnsi="Malgun Gothic" w:eastAsia="Malgun Gothic"/>
-          <w:sz w:val="22"/>
-        </w:rPr>
-        <w:t>## 2. 거래회전율은 정말 관심을 측정하는가</w:t>
+        <w:t>2. 거래회전율은 정말 관심을 측정하는가</w:t>
       </w:r>
     </w:p>
     <w:p>
@@ -326,14 +318,10 @@
     </w:p>
     <w:p>
       <w:pPr>
-        <w:spacing w:after="160" w:line="320" w:lineRule="auto"/>
+        <w:pStyle w:val="Heading2"/>
       </w:pPr>
       <w:r>
-        <w:rPr>
-          <w:rFonts w:ascii="Malgun Gothic" w:hAnsi="Malgun Gothic" w:eastAsia="Malgun Gothic"/>
-          <w:sz w:val="22"/>
-        </w:rPr>
-        <w:t>## 3. 여러 모델의 합의는 증거를 늘리는가</w:t>
+        <w:t>3. 여러 모델의 합의는 증거를 늘리는가</w:t>
       </w:r>
     </w:p>
     <w:p>
@@ -386,14 +374,10 @@
     </w:p>
     <w:p>
       <w:pPr>
-        <w:spacing w:after="160" w:line="320" w:lineRule="auto"/>
+        <w:pStyle w:val="Heading2"/>
       </w:pPr>
       <w:r>
-        <w:rPr>
-          <w:rFonts w:ascii="Malgun Gothic" w:hAnsi="Malgun Gothic" w:eastAsia="Malgun Gothic"/>
-          <w:sz w:val="22"/>
-        </w:rPr>
-        <w:t>## 4. 시장은 가격보다 먼저 모델의 실패 방식으로 드러날 수 있는가</w:t>
+        <w:t>4. 시장은 가격보다 먼저 모델의 실패 방식으로 드러날 수 있는가</w:t>
       </w:r>
     </w:p>
     <w:p>

</xml_diff>

<commit_message>
Harden parts two through four research claims
</commit_message>
<xml_diff>
--- a/deliverables/문병로_교수의_메트릭_스튜디오_02_00_블로그_게시용.docx
+++ b/deliverables/문병로_교수의_메트릭_스튜디오_02_00_블로그_게시용.docx
@@ -377,7 +377,7 @@
         <w:pStyle w:val="Heading2"/>
       </w:pPr>
       <w:r>
-        <w:t>4. 시장은 가격보다 먼저 모델의 실패 방식으로 드러날 수 있는가</w:t>
+        <w:t>4. 시장 상태는 모델의 공동 실패로 읽을 수 있는가</w:t>
       </w:r>
     </w:p>
     <w:p>
@@ -413,7 +413,7 @@
           <w:rFonts w:ascii="Malgun Gothic" w:hAnsi="Malgun Gothic" w:eastAsia="Malgun Gothic"/>
           <w:sz w:val="22"/>
         </w:rPr>
-        <w:t>그래서 질문을 바꿨다. 어느 모델이 다음 달을 맞힐지를 묻는 대신, 서로 다른 모델이 같은 시점에 기대를 배반하는지를 보자. 각 모델의 월별 성과를 표준화하고, 동시에 부진한 모델 수와 그 다음 시장 수익률의 관계를 점검했다. 여기서 모델의 공동 실패는 매수·매도 신호가 아니다. 내가 서로 독립적이라고 믿었던 설명들이 같은 충격에 무너졌다는 관측치다.</w:t>
+        <w:t>그래서 질문을 바꿨다. 어느 모델이 다음 달을 맞힐지를 묻는 대신, 서로 다른 모델이 같은 시점에 기대를 배반하는지를 보자. 각 모델의 월별 성과를 표준화한 뒤, 공동 실패가 관측된 다음 달의 수익률을 별도로 점검했다. 여기서 모델의 공동 실패는 매수·매도 신호가 아니다. 내가 서로 독립적이라고 믿었던 설명들이 같은 충격에 무너졌다는 관측치다.</w:t>
       </w:r>
     </w:p>
     <w:p>
@@ -425,7 +425,7 @@
           <w:rFonts w:ascii="Malgun Gothic" w:hAnsi="Malgun Gothic" w:eastAsia="Malgun Gothic"/>
           <w:sz w:val="22"/>
         </w:rPr>
-        <w:t>시장의 상태는 상승·하락 같은 사후 이름보다, 모델들이 함께 틀리는 방식으로 먼저 드러날 수 있다. 물론 작은 표본에서 나온 이 관계를 예측 규칙으로 과장할 수는 없다. 4편은 이 가설을 검증 가능한 상태 변수로 바꾸고, 어느 구간에서는 작동하지 않는지도 함께 남기는 시도다.</w:t>
+        <w:t>공동 실패는 시장을 가격보다 먼저 보여 주는 지표가 아니다. 가격으로 계산한 실패는 월말이 지나야 알 수 있다. 4편에서는 그 한계를 숨기지 않고 한 달 앞으로 밀어 검증한다. 현재 데이터에서 예측 관계가 남는지, 남지 않는지를 모두 기록하는 시도다.</w:t>
       </w:r>
     </w:p>
     <w:p>

</xml_diff>